<commit_message>
Actualización de cambiar contraseña
</commit_message>
<xml_diff>
--- a/Fase 2/Evidencias Proyecto/Evidencias de documentacion/Documento Product Backlog y Sprint Backlog 1.docx
+++ b/Fase 2/Evidencias Proyecto/Evidencias de documentacion/Documento Product Backlog y Sprint Backlog 1.docx
@@ -247,7 +247,22 @@
           <w:szCs w:val="48"/>
           <w:rtl w:val="0"/>
         </w:rPr>
-        <w:t xml:space="preserve">y Sprint Backlog 1</w:t>
+        <w:t xml:space="preserve">y Sprint Backlog </w:t>
+      </w:r>
+      <w:r>
+        <w:rPr>
+          <w:b w:val="1"/>
+          <w:bCs w:val="1"/>
+          <w:sz w:val="48"/>
+          <w:szCs w:val="48"/>
+          <w:rtl w:val="0"/>
+        </w:rPr>
+        <w:t xml:space="preserve">1</w:t>
+      </w:r>
+      <w:r>
+        <w:rPr>
+          <w:rtl w:val="0"/>
+        </w:rPr>
       </w:r>
     </w:p>
     <w:p>
@@ -796,7 +811,7 @@
     </w:p>
     <w:sdt>
       <w:sdtPr>
-        <w:id w:val="-1662623530"/>
+        <w:id w:val="-1254282915"/>
         <w:docPartObj>
           <w:docPartGallery w:val="Table of Contents"/>
           <w:docPartUnique w:val="1"/>
@@ -6926,7 +6941,24 @@
           <w:vertAlign w:val="baseline"/>
           <w:rtl w:val="0"/>
         </w:rPr>
-        <w:t xml:space="preserve">Gráfico Burndown Chart inicial del Sprint 1</w:t>
+        <w:t xml:space="preserve">Gráfico Burndown Chart inicial del Sprint </w:t>
+      </w:r>
+      <w:r>
+        <w:rPr>
+          <w:rFonts w:ascii="Cambria" w:cs="Cambria" w:eastAsia="Cambria" w:hAnsi="Cambria"/>
+          <w:b w:val="1"/>
+          <w:bCs w:val="1"/>
+          <w:color w:val="366091"/>
+          <w:sz w:val="28"/>
+          <w:szCs w:val="28"/>
+          <w:rtl w:val="0"/>
+        </w:rPr>
+        <w:t xml:space="preserve">Backlog 1</w:t>
+      </w:r>
+      <w:r>
+        <w:rPr>
+          <w:rtl w:val="0"/>
+        </w:rPr>
       </w:r>
     </w:p>
     <w:p>
@@ -6943,20 +6975,20 @@
           <wp:anchor allowOverlap="1" behindDoc="1" distB="114300" distT="114300" distL="114300" distR="114300" hidden="0" layoutInCell="1" locked="0" relativeHeight="0" simplePos="0">
             <wp:simplePos x="0" y="0"/>
             <wp:positionH relativeFrom="column">
-              <wp:posOffset>-1095374</wp:posOffset>
+              <wp:posOffset>-1099184</wp:posOffset>
             </wp:positionH>
             <wp:positionV relativeFrom="paragraph">
-              <wp:posOffset>323850</wp:posOffset>
+              <wp:posOffset>294537</wp:posOffset>
             </wp:positionV>
-            <wp:extent cx="7889848" cy="2646044"/>
+            <wp:extent cx="7810500" cy="2627732"/>
             <wp:effectExtent b="0" l="0" r="0" t="0"/>
             <wp:wrapNone/>
-            <wp:docPr id="8" name="image2.png"/>
+            <wp:docPr id="7" name="image1.png"/>
             <a:graphic>
               <a:graphicData uri="http://schemas.openxmlformats.org/drawingml/2006/picture">
                 <pic:pic>
                   <pic:nvPicPr>
-                    <pic:cNvPr id="0" name="image2.png"/>
+                    <pic:cNvPr id="0" name="image1.png"/>
                     <pic:cNvPicPr preferRelativeResize="0"/>
                   </pic:nvPicPr>
                   <pic:blipFill>
@@ -6969,7 +7001,7 @@
                   <pic:spPr>
                     <a:xfrm>
                       <a:off x="0" y="0"/>
-                      <a:ext cx="7889848" cy="2646044"/>
+                      <a:ext cx="7810500" cy="2627732"/>
                     </a:xfrm>
                     <a:prstGeom prst="rect"/>
                     <a:ln/>
@@ -7201,12 +7233,12 @@
           <wp:extent cx="932815" cy="231775"/>
           <wp:effectExtent b="0" l="0" r="0" t="0"/>
           <wp:wrapSquare wrapText="bothSides" distB="0" distT="0" distL="114300" distR="114300"/>
-          <wp:docPr id="7" name="image1.png"/>
+          <wp:docPr id="8" name="image2.png"/>
           <a:graphic>
             <a:graphicData uri="http://schemas.openxmlformats.org/drawingml/2006/picture">
               <pic:pic>
                 <pic:nvPicPr>
-                  <pic:cNvPr id="0" name="image1.png"/>
+                  <pic:cNvPr id="0" name="image2.png"/>
                   <pic:cNvPicPr preferRelativeResize="0"/>
                 </pic:nvPicPr>
                 <pic:blipFill>

</xml_diff>